<commit_message>
vault backup: 2026-05-16 09:02:15
</commit_message>
<xml_diff>
--- a/01_Courses/01_Active/00_BSKT/00_Kinh Te Vi Mo/07_AI-Workspace/Outputs/Tieu-luan-Cung-Cau-Canh-tranh-hoan-hao.docx
+++ b/01_Courses/01_Active/00_BSKT/00_Kinh Te Vi Mo/07_AI-Workspace/Outputs/Tieu-luan-Cung-Cau-Canh-tranh-hoan-hao.docx
@@ -1048,7 +1048,7 @@
       <w:r>
         <w:drawing>
           <wp:inline xmlns:wp="http://schemas.openxmlformats.org/drawingml/2006/wordprocessingDrawing" distT="0" distB="0" distL="0" distR="0">
-            <wp:extent cx="5486400" cy="3339414"/>
+            <wp:extent cx="5486400" cy="3317887"/>
             <wp:docPr id="1" name="hinh1_xuat_khau_ca_phe.png"/>
             <a:graphic xmlns:a="http://schemas.openxmlformats.org/drawingml/2006/main">
               <a:graphicData uri="http://schemas.openxmlformats.org/drawingml/2006/picture">
@@ -1066,7 +1066,7 @@
                   <pic:spPr>
                     <a:xfrm>
                       <a:off x="0" y="0"/>
-                      <a:ext cx="5486400" cy="3339414"/>
+                      <a:ext cx="5486400" cy="3317887"/>
                     </a:xfrm>
                     <a:prstGeom prst="rect">
                       <a:avLst/>
@@ -1181,32 +1181,207 @@
     </w:p>
     <w:p>
       <w:pPr>
-        <w:pStyle w:val="Normal"/>
-        <w:jc w:val="both"/>
-        <w:spacing w:line="288" w:lineRule="auto" w:before="0" w:after="120"/>
-      </w:pPr>
-      <w:r>
-        <w:rPr>
-          <w:rFonts w:ascii="Times New Roman" w:hAnsi="Times New Roman" w:eastAsia="Times New Roman" w:cs="Times New Roman"/>
-          <w:sz w:val="26"/>
-          <w:szCs w:val="26"/>
-        </w:rPr>
-        <w:t xml:space="preserve">$$Q_D^X = f(P_X,\ P_Y,\ I,\ N,\ T,\ E,\ ...)$$</w:t>
-      </w:r>
-    </w:p>
-    <w:p>
-      <w:pPr>
-        <w:pStyle w:val="Normal"/>
-        <w:jc w:val="both"/>
-        <w:spacing w:line="288" w:lineRule="auto" w:before="0" w:after="120"/>
-      </w:pPr>
-      <w:r>
-        <w:rPr>
-          <w:rFonts w:ascii="Times New Roman" w:hAnsi="Times New Roman" w:eastAsia="Times New Roman" w:cs="Times New Roman"/>
-          <w:sz w:val="26"/>
-          <w:szCs w:val="26"/>
-        </w:rPr>
-        <w:t xml:space="preserve">Trong đó: $P_X$ — giá hàng hóa X; $P_Y$ — giá hàng hóa liên quan; $I$ — thu nhập; $N$ — quy mô thị trường; $T$ — thị hiếu; $E$ — kỳ vọng.</w:t>
+        <w:jc w:val="center"/>
+        <w:spacing w:line="288" w:lineRule="auto" w:before="120" w:after="120"/>
+      </w:pPr>
+      <m:oMathPara xmlns:m="http://schemas.openxmlformats.org/officeDocument/2006/math">
+        <m:oMath>
+          <m:r>
+            <m:t>Q_D^X</m:t>
+          </m:r>
+          <m:r>
+            <m:t xml:space="preserve"> = </m:t>
+          </m:r>
+          <m:r>
+            <m:t>f</m:t>
+          </m:r>
+          <m:r>
+            <m:t xml:space="preserve"> ( </m:t>
+          </m:r>
+          <m:sSub>
+            <m:sSubPr>
+              <m:ctrlPr/>
+            </m:sSubPr>
+            <m:e>
+              <m:r>
+                <m:t>P</m:t>
+              </m:r>
+            </m:e>
+            <m:sub>
+              <m:r>
+                <m:t>X</m:t>
+              </m:r>
+            </m:sub>
+          </m:sSub>
+          <m:r>
+            <m:t xml:space="preserve"> , </m:t>
+          </m:r>
+          <m:sSub>
+            <m:sSubPr>
+              <m:ctrlPr/>
+            </m:sSubPr>
+            <m:e>
+              <m:r>
+                <m:t>P</m:t>
+              </m:r>
+            </m:e>
+            <m:sub>
+              <m:r>
+                <m:t>Y</m:t>
+              </m:r>
+            </m:sub>
+          </m:sSub>
+          <m:r>
+            <m:t xml:space="preserve"> , </m:t>
+          </m:r>
+          <m:r>
+            <m:t>I</m:t>
+          </m:r>
+          <m:r>
+            <m:t xml:space="preserve"> , </m:t>
+          </m:r>
+          <m:r>
+            <m:t>N</m:t>
+          </m:r>
+          <m:r>
+            <m:t xml:space="preserve"> , </m:t>
+          </m:r>
+          <m:r>
+            <m:t>T</m:t>
+          </m:r>
+          <m:r>
+            <m:t xml:space="preserve"> , </m:t>
+          </m:r>
+          <m:r>
+            <m:t>E</m:t>
+          </m:r>
+          <m:r>
+            <m:t xml:space="preserve"> , </m:t>
+          </m:r>
+          <m:r>
+            <m:t xml:space="preserve"> ... </m:t>
+          </m:r>
+          <m:r>
+            <m:t xml:space="preserve"> ) </m:t>
+          </m:r>
+        </m:oMath>
+      </m:oMathPara>
+    </w:p>
+    <w:p>
+      <w:pPr>
+        <w:pStyle w:val="Normal"/>
+        <w:jc w:val="both"/>
+        <w:spacing w:line="288" w:lineRule="auto" w:before="0" w:after="120"/>
+      </w:pPr>
+      <w:r>
+        <w:rPr>
+          <w:rFonts w:ascii="Times New Roman" w:hAnsi="Times New Roman" w:eastAsia="Times New Roman" w:cs="Times New Roman"/>
+          <w:sz w:val="26"/>
+          <w:szCs w:val="26"/>
+        </w:rPr>
+        <w:t xml:space="preserve">Trong đó: </w:t>
+      </w:r>
+      <m:oMath xmlns:m="http://schemas.openxmlformats.org/officeDocument/2006/math">
+        <m:sSub>
+          <m:sSubPr>
+            <m:ctrlPr/>
+          </m:sSubPr>
+          <m:e>
+            <m:r>
+              <m:t>P</m:t>
+            </m:r>
+          </m:e>
+          <m:sub>
+            <m:r>
+              <m:t>X</m:t>
+            </m:r>
+          </m:sub>
+        </m:sSub>
+      </m:oMath>
+      <w:r>
+        <w:rPr>
+          <w:rFonts w:ascii="Times New Roman" w:hAnsi="Times New Roman" w:eastAsia="Times New Roman" w:cs="Times New Roman"/>
+          <w:sz w:val="26"/>
+          <w:szCs w:val="26"/>
+        </w:rPr>
+        <w:t xml:space="preserve"> — giá hàng hóa X; </w:t>
+      </w:r>
+      <m:oMath xmlns:m="http://schemas.openxmlformats.org/officeDocument/2006/math">
+        <m:sSub>
+          <m:sSubPr>
+            <m:ctrlPr/>
+          </m:sSubPr>
+          <m:e>
+            <m:r>
+              <m:t>P</m:t>
+            </m:r>
+          </m:e>
+          <m:sub>
+            <m:r>
+              <m:t>Y</m:t>
+            </m:r>
+          </m:sub>
+        </m:sSub>
+      </m:oMath>
+      <w:r>
+        <w:rPr>
+          <w:rFonts w:ascii="Times New Roman" w:hAnsi="Times New Roman" w:eastAsia="Times New Roman" w:cs="Times New Roman"/>
+          <w:sz w:val="26"/>
+          <w:szCs w:val="26"/>
+        </w:rPr>
+        <w:t xml:space="preserve"> — giá hàng hóa liên quan; </w:t>
+      </w:r>
+      <m:oMath xmlns:m="http://schemas.openxmlformats.org/officeDocument/2006/math">
+        <m:r>
+          <m:t>I</m:t>
+        </m:r>
+      </m:oMath>
+      <w:r>
+        <w:rPr>
+          <w:rFonts w:ascii="Times New Roman" w:hAnsi="Times New Roman" w:eastAsia="Times New Roman" w:cs="Times New Roman"/>
+          <w:sz w:val="26"/>
+          <w:szCs w:val="26"/>
+        </w:rPr>
+        <w:t xml:space="preserve"> — thu nhập; </w:t>
+      </w:r>
+      <m:oMath xmlns:m="http://schemas.openxmlformats.org/officeDocument/2006/math">
+        <m:r>
+          <m:t>N</m:t>
+        </m:r>
+      </m:oMath>
+      <w:r>
+        <w:rPr>
+          <w:rFonts w:ascii="Times New Roman" w:hAnsi="Times New Roman" w:eastAsia="Times New Roman" w:cs="Times New Roman"/>
+          <w:sz w:val="26"/>
+          <w:szCs w:val="26"/>
+        </w:rPr>
+        <w:t xml:space="preserve"> — quy mô thị trường; </w:t>
+      </w:r>
+      <m:oMath xmlns:m="http://schemas.openxmlformats.org/officeDocument/2006/math">
+        <m:r>
+          <m:t>T</m:t>
+        </m:r>
+      </m:oMath>
+      <w:r>
+        <w:rPr>
+          <w:rFonts w:ascii="Times New Roman" w:hAnsi="Times New Roman" w:eastAsia="Times New Roman" w:cs="Times New Roman"/>
+          <w:sz w:val="26"/>
+          <w:szCs w:val="26"/>
+        </w:rPr>
+        <w:t xml:space="preserve"> — thị hiếu; </w:t>
+      </w:r>
+      <m:oMath xmlns:m="http://schemas.openxmlformats.org/officeDocument/2006/math">
+        <m:r>
+          <m:t>E</m:t>
+        </m:r>
+      </m:oMath>
+      <w:r>
+        <w:rPr>
+          <w:rFonts w:ascii="Times New Roman" w:hAnsi="Times New Roman" w:eastAsia="Times New Roman" w:cs="Times New Roman"/>
+          <w:sz w:val="26"/>
+          <w:szCs w:val="26"/>
+        </w:rPr>
+        <w:t xml:space="preserve"> — kỳ vọng.</w:t>
       </w:r>
     </w:p>
     <w:p>
@@ -1241,32 +1416,163 @@
     </w:p>
     <w:p>
       <w:pPr>
-        <w:pStyle w:val="Normal"/>
-        <w:jc w:val="both"/>
-        <w:spacing w:line="288" w:lineRule="auto" w:before="0" w:after="120"/>
-      </w:pPr>
-      <w:r>
-        <w:rPr>
-          <w:rFonts w:ascii="Times New Roman" w:hAnsi="Times New Roman" w:eastAsia="Times New Roman" w:cs="Times New Roman"/>
-          <w:sz w:val="26"/>
-          <w:szCs w:val="26"/>
-        </w:rPr>
-        <w:t xml:space="preserve">$$Q_S^X = g(P_X,\ P_Y,\ Te,\ G,\ E,\ ...)$$</w:t>
-      </w:r>
-    </w:p>
-    <w:p>
-      <w:pPr>
-        <w:pStyle w:val="Normal"/>
-        <w:jc w:val="both"/>
-        <w:spacing w:line="288" w:lineRule="auto" w:before="0" w:after="120"/>
-      </w:pPr>
-      <w:r>
-        <w:rPr>
-          <w:rFonts w:ascii="Times New Roman" w:hAnsi="Times New Roman" w:eastAsia="Times New Roman" w:cs="Times New Roman"/>
-          <w:sz w:val="26"/>
-          <w:szCs w:val="26"/>
-        </w:rPr>
-        <w:t xml:space="preserve">Trong đó: $P_Y$ — giá yếu tố sản xuất; $Te$ — công nghệ; $G$ — chính sách chính phủ; $E$ — kỳ vọng nhà sản xuất.</w:t>
+        <w:jc w:val="center"/>
+        <w:spacing w:line="288" w:lineRule="auto" w:before="120" w:after="120"/>
+      </w:pPr>
+      <m:oMathPara xmlns:m="http://schemas.openxmlformats.org/officeDocument/2006/math">
+        <m:oMath>
+          <m:r>
+            <m:t>Q_S^X</m:t>
+          </m:r>
+          <m:r>
+            <m:t xml:space="preserve"> = </m:t>
+          </m:r>
+          <m:r>
+            <m:t>g</m:t>
+          </m:r>
+          <m:r>
+            <m:t xml:space="preserve"> ( </m:t>
+          </m:r>
+          <m:sSub>
+            <m:sSubPr>
+              <m:ctrlPr/>
+            </m:sSubPr>
+            <m:e>
+              <m:r>
+                <m:t>P</m:t>
+              </m:r>
+            </m:e>
+            <m:sub>
+              <m:r>
+                <m:t>X</m:t>
+              </m:r>
+            </m:sub>
+          </m:sSub>
+          <m:r>
+            <m:t xml:space="preserve"> , </m:t>
+          </m:r>
+          <m:sSub>
+            <m:sSubPr>
+              <m:ctrlPr/>
+            </m:sSubPr>
+            <m:e>
+              <m:r>
+                <m:t>P</m:t>
+              </m:r>
+            </m:e>
+            <m:sub>
+              <m:r>
+                <m:t>Y</m:t>
+              </m:r>
+            </m:sub>
+          </m:sSub>
+          <m:r>
+            <m:t xml:space="preserve"> , </m:t>
+          </m:r>
+          <m:r>
+            <m:t>Te</m:t>
+          </m:r>
+          <m:r>
+            <m:t xml:space="preserve"> , </m:t>
+          </m:r>
+          <m:r>
+            <m:t>G</m:t>
+          </m:r>
+          <m:r>
+            <m:t xml:space="preserve"> , </m:t>
+          </m:r>
+          <m:r>
+            <m:t>E</m:t>
+          </m:r>
+          <m:r>
+            <m:t xml:space="preserve"> , </m:t>
+          </m:r>
+          <m:r>
+            <m:t xml:space="preserve"> ... </m:t>
+          </m:r>
+          <m:r>
+            <m:t xml:space="preserve"> ) </m:t>
+          </m:r>
+        </m:oMath>
+      </m:oMathPara>
+    </w:p>
+    <w:p>
+      <w:pPr>
+        <w:pStyle w:val="Normal"/>
+        <w:jc w:val="both"/>
+        <w:spacing w:line="288" w:lineRule="auto" w:before="0" w:after="120"/>
+      </w:pPr>
+      <w:r>
+        <w:rPr>
+          <w:rFonts w:ascii="Times New Roman" w:hAnsi="Times New Roman" w:eastAsia="Times New Roman" w:cs="Times New Roman"/>
+          <w:sz w:val="26"/>
+          <w:szCs w:val="26"/>
+        </w:rPr>
+        <w:t xml:space="preserve">Trong đó: </w:t>
+      </w:r>
+      <m:oMath xmlns:m="http://schemas.openxmlformats.org/officeDocument/2006/math">
+        <m:sSub>
+          <m:sSubPr>
+            <m:ctrlPr/>
+          </m:sSubPr>
+          <m:e>
+            <m:r>
+              <m:t>P</m:t>
+            </m:r>
+          </m:e>
+          <m:sub>
+            <m:r>
+              <m:t>Y</m:t>
+            </m:r>
+          </m:sub>
+        </m:sSub>
+      </m:oMath>
+      <w:r>
+        <w:rPr>
+          <w:rFonts w:ascii="Times New Roman" w:hAnsi="Times New Roman" w:eastAsia="Times New Roman" w:cs="Times New Roman"/>
+          <w:sz w:val="26"/>
+          <w:szCs w:val="26"/>
+        </w:rPr>
+        <w:t xml:space="preserve"> — giá yếu tố sản xuất; </w:t>
+      </w:r>
+      <m:oMath xmlns:m="http://schemas.openxmlformats.org/officeDocument/2006/math">
+        <m:r>
+          <m:t>Te</m:t>
+        </m:r>
+      </m:oMath>
+      <w:r>
+        <w:rPr>
+          <w:rFonts w:ascii="Times New Roman" w:hAnsi="Times New Roman" w:eastAsia="Times New Roman" w:cs="Times New Roman"/>
+          <w:sz w:val="26"/>
+          <w:szCs w:val="26"/>
+        </w:rPr>
+        <w:t xml:space="preserve"> — công nghệ; </w:t>
+      </w:r>
+      <m:oMath xmlns:m="http://schemas.openxmlformats.org/officeDocument/2006/math">
+        <m:r>
+          <m:t>G</m:t>
+        </m:r>
+      </m:oMath>
+      <w:r>
+        <w:rPr>
+          <w:rFonts w:ascii="Times New Roman" w:hAnsi="Times New Roman" w:eastAsia="Times New Roman" w:cs="Times New Roman"/>
+          <w:sz w:val="26"/>
+          <w:szCs w:val="26"/>
+        </w:rPr>
+        <w:t xml:space="preserve"> — chính sách chính phủ; </w:t>
+      </w:r>
+      <m:oMath xmlns:m="http://schemas.openxmlformats.org/officeDocument/2006/math">
+        <m:r>
+          <m:t>E</m:t>
+        </m:r>
+      </m:oMath>
+      <w:r>
+        <w:rPr>
+          <w:rFonts w:ascii="Times New Roman" w:hAnsi="Times New Roman" w:eastAsia="Times New Roman" w:cs="Times New Roman"/>
+          <w:sz w:val="26"/>
+          <w:szCs w:val="26"/>
+        </w:rPr>
+        <w:t xml:space="preserve"> — kỳ vọng nhà sản xuất.</w:t>
       </w:r>
     </w:p>
     <w:p>
@@ -2002,7 +2308,7 @@
       <w:r>
         <w:drawing>
           <wp:inline xmlns:wp="http://schemas.openxmlformats.org/drawingml/2006/wordprocessingDrawing" distT="0" distB="0" distL="0" distR="0">
-            <wp:extent cx="5486400" cy="3027086"/>
+            <wp:extent cx="5486400" cy="3314141"/>
             <wp:docPr id="2" name="hinh3_gdp_per_capita.png"/>
             <a:graphic xmlns:a="http://schemas.openxmlformats.org/drawingml/2006/main">
               <a:graphicData uri="http://schemas.openxmlformats.org/drawingml/2006/picture">
@@ -2020,7 +2326,7 @@
                   <pic:spPr>
                     <a:xfrm>
                       <a:off x="0" y="0"/>
-                      <a:ext cx="5486400" cy="3027086"/>
+                      <a:ext cx="5486400" cy="3314141"/>
                     </a:xfrm>
                     <a:prstGeom prst="rect">
                       <a:avLst/>
@@ -2793,7 +3099,7 @@
       <w:r>
         <w:drawing>
           <wp:inline xmlns:wp="http://schemas.openxmlformats.org/drawingml/2006/wordprocessingDrawing" distT="0" distB="0" distL="0" distR="0">
-            <wp:extent cx="5486400" cy="3410747"/>
+            <wp:extent cx="5486400" cy="3512434"/>
             <wp:docPr id="3" name="hinh2_gia_robusta.png"/>
             <a:graphic xmlns:a="http://schemas.openxmlformats.org/drawingml/2006/main">
               <a:graphicData uri="http://schemas.openxmlformats.org/drawingml/2006/picture">
@@ -2811,7 +3117,7 @@
                   <pic:spPr>
                     <a:xfrm>
                       <a:off x="0" y="0"/>
-                      <a:ext cx="5486400" cy="3410747"/>
+                      <a:ext cx="5486400" cy="3512434"/>
                     </a:xfrm>
                     <a:prstGeom prst="rect">
                       <a:avLst/>
@@ -4463,22 +4769,134 @@
           <w:sz w:val="26"/>
           <w:szCs w:val="26"/>
         </w:rPr>
-        <w:t xml:space="preserve">Hệ quả quan trọng: giá bán bằng doanh thu cận biên bằng doanh thu bình quân ($P = MR = AR$). Doanh nghiệp tối đa hóa lợi nhuận bằng cách chọn sản lượng tại đó $MC = MR = P$, tức chỉ ra quyết định về sản lượng, không phải về giá. Giá cả được quyết định bởi quy luật cung–cầu thị trường thông qua "bàn tay vô hình" (Adam Smith, 1776): sự tương tác giữa tổng cung và tổng cầu tự động xác định mức giá cân bằng.</w:t>
-      </w:r>
-    </w:p>
-    <w:p>
-      <w:pPr>
-        <w:pStyle w:val="Normal"/>
-        <w:jc w:val="both"/>
-        <w:spacing w:line="288" w:lineRule="auto" w:before="0" w:after="120"/>
-      </w:pPr>
-      <w:r>
-        <w:rPr>
-          <w:rFonts w:ascii="Times New Roman" w:hAnsi="Times New Roman" w:eastAsia="Times New Roman" w:cs="Times New Roman"/>
-          <w:sz w:val="26"/>
-          <w:szCs w:val="26"/>
-        </w:rPr>
-        <w:t xml:space="preserve">Trong dài hạn, cơ chế tự do gia nhập và rút lui đảm bảo lợi nhuận kinh tế bằng không ($\pi_{economic} = 0$), giá bằng chi phí bình quân dài hạn tối thiểu ($P = LAC_{min}$), phản ánh hiệu quả phân bổ nguồn lực cao nhất.</w:t>
+        <w:t xml:space="preserve">Hệ quả quan trọng: giá bán bằng doanh thu cận biên bằng doanh thu bình quân (</w:t>
+      </w:r>
+      <m:oMath xmlns:m="http://schemas.openxmlformats.org/officeDocument/2006/math">
+        <m:r>
+          <m:t>P</m:t>
+        </m:r>
+        <m:r>
+          <m:t xml:space="preserve"> = </m:t>
+        </m:r>
+        <m:r>
+          <m:t>MR</m:t>
+        </m:r>
+        <m:r>
+          <m:t xml:space="preserve"> = </m:t>
+        </m:r>
+        <m:r>
+          <m:t>AR</m:t>
+        </m:r>
+      </m:oMath>
+      <w:r>
+        <w:rPr>
+          <w:rFonts w:ascii="Times New Roman" w:hAnsi="Times New Roman" w:eastAsia="Times New Roman" w:cs="Times New Roman"/>
+          <w:sz w:val="26"/>
+          <w:szCs w:val="26"/>
+        </w:rPr>
+        <w:t xml:space="preserve">). Doanh nghiệp tối đa hóa lợi nhuận bằng cách chọn sản lượng tại đó </w:t>
+      </w:r>
+      <m:oMath xmlns:m="http://schemas.openxmlformats.org/officeDocument/2006/math">
+        <m:r>
+          <m:t>MC</m:t>
+        </m:r>
+        <m:r>
+          <m:t xml:space="preserve"> = </m:t>
+        </m:r>
+        <m:r>
+          <m:t>MR</m:t>
+        </m:r>
+        <m:r>
+          <m:t xml:space="preserve"> = </m:t>
+        </m:r>
+        <m:r>
+          <m:t>P</m:t>
+        </m:r>
+      </m:oMath>
+      <w:r>
+        <w:rPr>
+          <w:rFonts w:ascii="Times New Roman" w:hAnsi="Times New Roman" w:eastAsia="Times New Roman" w:cs="Times New Roman"/>
+          <w:sz w:val="26"/>
+          <w:szCs w:val="26"/>
+        </w:rPr>
+        <w:t xml:space="preserve">, tức chỉ ra quyết định về sản lượng, không phải về giá. Giá cả được quyết định bởi quy luật cung–cầu thị trường thông qua "bàn tay vô hình" (Adam Smith, 1776): sự tương tác giữa tổng cung và tổng cầu tự động xác định mức giá cân bằng.</w:t>
+      </w:r>
+    </w:p>
+    <w:p>
+      <w:pPr>
+        <w:pStyle w:val="Normal"/>
+        <w:jc w:val="both"/>
+        <w:spacing w:line="288" w:lineRule="auto" w:before="0" w:after="120"/>
+      </w:pPr>
+      <w:r>
+        <w:rPr>
+          <w:rFonts w:ascii="Times New Roman" w:hAnsi="Times New Roman" w:eastAsia="Times New Roman" w:cs="Times New Roman"/>
+          <w:sz w:val="26"/>
+          <w:szCs w:val="26"/>
+        </w:rPr>
+        <w:t xml:space="preserve">Trong dài hạn, cơ chế tự do gia nhập và rút lui đảm bảo lợi nhuận kinh tế bằng không (</w:t>
+      </w:r>
+      <m:oMath xmlns:m="http://schemas.openxmlformats.org/officeDocument/2006/math">
+        <m:sSub>
+          <m:sSubPr>
+            <m:ctrlPr/>
+          </m:sSubPr>
+          <m:e>
+            <m:r>
+              <m:t>u{03C0}</m:t>
+            </m:r>
+          </m:e>
+          <m:sub>
+            <m:r>
+              <m:t>economic</m:t>
+            </m:r>
+          </m:sub>
+        </m:sSub>
+        <m:r>
+          <m:t xml:space="preserve"> = </m:t>
+        </m:r>
+        <m:r>
+          <m:t>0</m:t>
+        </m:r>
+      </m:oMath>
+      <w:r>
+        <w:rPr>
+          <w:rFonts w:ascii="Times New Roman" w:hAnsi="Times New Roman" w:eastAsia="Times New Roman" w:cs="Times New Roman"/>
+          <w:sz w:val="26"/>
+          <w:szCs w:val="26"/>
+        </w:rPr>
+        <w:t xml:space="preserve">), giá bằng chi phí bình quân dài hạn tối thiểu (</w:t>
+      </w:r>
+      <m:oMath xmlns:m="http://schemas.openxmlformats.org/officeDocument/2006/math">
+        <m:r>
+          <m:t>P</m:t>
+        </m:r>
+        <m:r>
+          <m:t xml:space="preserve"> = </m:t>
+        </m:r>
+        <m:sSub>
+          <m:sSubPr>
+            <m:ctrlPr/>
+          </m:sSubPr>
+          <m:e>
+            <m:r>
+              <m:t>LAC</m:t>
+            </m:r>
+          </m:e>
+          <m:sub>
+            <m:r>
+              <m:t>min</m:t>
+            </m:r>
+          </m:sub>
+        </m:sSub>
+      </m:oMath>
+      <w:r>
+        <w:rPr>
+          <w:rFonts w:ascii="Times New Roman" w:hAnsi="Times New Roman" w:eastAsia="Times New Roman" w:cs="Times New Roman"/>
+          <w:sz w:val="26"/>
+          <w:szCs w:val="26"/>
+        </w:rPr>
+        <w:t xml:space="preserve">), phản ánh hiệu quả phân bổ nguồn lực cao nhất.</w:t>
       </w:r>
     </w:p>
     <w:p>

</xml_diff>